<commit_message>
Stabilized GCN_Baseline_Model and Review 3 planning
</commit_message>
<xml_diff>
--- a/Documents/v1 planning.docx
+++ b/Documents/v1 planning.docx
@@ -2299,6 +2299,933 @@
         <w:t>The unknown node may not have a training label, but its existence and connections can still contribute to message passing.</w:t>
       </w:r>
     </w:p>
+    <w:p/>
+    <w:p/>
+    <w:tbl>
+      <w:tblPr>
+        <w:tblStyle w:val="GridTable5Dark-Accent5"/>
+        <w:tblW w:w="0" w:type="auto"/>
+        <w:tblLook w:val="04A0" w:firstRow="1" w:lastRow="0" w:firstColumn="1" w:lastColumn="0" w:noHBand="0" w:noVBand="1"/>
+      </w:tblPr>
+      <w:tblGrid>
+        <w:gridCol w:w="1350"/>
+        <w:gridCol w:w="1134"/>
+        <w:gridCol w:w="1349"/>
+        <w:gridCol w:w="1134"/>
+      </w:tblGrid>
+      <w:tr>
+        <w:trPr>
+          <w:cnfStyle w:val="100000000000" w:firstRow="1" w:lastRow="0" w:firstColumn="0" w:lastColumn="0" w:oddVBand="0" w:evenVBand="0" w:oddHBand="0" w:evenHBand="0" w:firstRowFirstColumn="0" w:firstRowLastColumn="0" w:lastRowFirstColumn="0" w:lastRowLastColumn="0"/>
+        </w:trPr>
+        <w:tc>
+          <w:tcPr>
+            <w:cnfStyle w:val="001000000000" w:firstRow="0" w:lastRow="0" w:firstColumn="1" w:lastColumn="0" w:oddVBand="0" w:evenVBand="0" w:oddHBand="0" w:evenHBand="0" w:firstRowFirstColumn="0" w:firstRowLastColumn="0" w:lastRowFirstColumn="0" w:lastRowLastColumn="0"/>
+            <w:tcW w:w="1134" w:type="dxa"/>
+            <w:hideMark/>
+          </w:tcPr>
+          <w:p>
+            <w:pPr>
+              <w:spacing w:after="160" w:line="278" w:lineRule="auto"/>
+            </w:pPr>
+            <w:r>
+              <w:t>Metric</w:t>
+            </w:r>
+          </w:p>
+        </w:tc>
+        <w:tc>
+          <w:tcPr>
+            <w:tcW w:w="1134" w:type="dxa"/>
+            <w:hideMark/>
+          </w:tcPr>
+          <w:p>
+            <w:pPr>
+              <w:spacing w:after="160" w:line="278" w:lineRule="auto"/>
+              <w:cnfStyle w:val="100000000000" w:firstRow="1" w:lastRow="0" w:firstColumn="0" w:lastColumn="0" w:oddVBand="0" w:evenVBand="0" w:oddHBand="0" w:evenHBand="0" w:firstRowFirstColumn="0" w:firstRowLastColumn="0" w:lastRowFirstColumn="0" w:lastRowLastColumn="0"/>
+            </w:pPr>
+            <w:r>
+              <w:t>GCN</w:t>
+            </w:r>
+          </w:p>
+        </w:tc>
+        <w:tc>
+          <w:tcPr>
+            <w:tcW w:w="1134" w:type="dxa"/>
+            <w:hideMark/>
+          </w:tcPr>
+          <w:p>
+            <w:pPr>
+              <w:spacing w:after="160" w:line="278" w:lineRule="auto"/>
+              <w:cnfStyle w:val="100000000000" w:firstRow="1" w:lastRow="0" w:firstColumn="0" w:lastColumn="0" w:oddVBand="0" w:evenVBand="0" w:oddHBand="0" w:evenHBand="0" w:firstRowFirstColumn="0" w:firstRowLastColumn="0" w:lastRowFirstColumn="0" w:lastRowLastColumn="0"/>
+            </w:pPr>
+            <w:proofErr w:type="spellStart"/>
+            <w:r>
+              <w:t>GraphSAGE</w:t>
+            </w:r>
+            <w:proofErr w:type="spellEnd"/>
+          </w:p>
+        </w:tc>
+        <w:tc>
+          <w:tcPr>
+            <w:tcW w:w="1134" w:type="dxa"/>
+            <w:hideMark/>
+          </w:tcPr>
+          <w:p>
+            <w:pPr>
+              <w:spacing w:after="160" w:line="278" w:lineRule="auto"/>
+              <w:cnfStyle w:val="100000000000" w:firstRow="1" w:lastRow="0" w:firstColumn="0" w:lastColumn="0" w:oddVBand="0" w:evenVBand="0" w:oddHBand="0" w:evenHBand="0" w:firstRowFirstColumn="0" w:firstRowLastColumn="0" w:lastRowFirstColumn="0" w:lastRowLastColumn="0"/>
+            </w:pPr>
+            <w:r>
+              <w:t>GAT</w:t>
+            </w:r>
+          </w:p>
+        </w:tc>
+      </w:tr>
+      <w:tr>
+        <w:trPr>
+          <w:cnfStyle w:val="000000100000" w:firstRow="0" w:lastRow="0" w:firstColumn="0" w:lastColumn="0" w:oddVBand="0" w:evenVBand="0" w:oddHBand="1" w:evenHBand="0" w:firstRowFirstColumn="0" w:firstRowLastColumn="0" w:lastRowFirstColumn="0" w:lastRowLastColumn="0"/>
+        </w:trPr>
+        <w:tc>
+          <w:tcPr>
+            <w:cnfStyle w:val="001000000000" w:firstRow="0" w:lastRow="0" w:firstColumn="1" w:lastColumn="0" w:oddVBand="0" w:evenVBand="0" w:oddHBand="0" w:evenHBand="0" w:firstRowFirstColumn="0" w:firstRowLastColumn="0" w:lastRowFirstColumn="0" w:lastRowLastColumn="0"/>
+            <w:tcW w:w="1134" w:type="dxa"/>
+            <w:hideMark/>
+          </w:tcPr>
+          <w:p>
+            <w:pPr>
+              <w:spacing w:after="160" w:line="278" w:lineRule="auto"/>
+            </w:pPr>
+            <w:r>
+              <w:t>Accuracy</w:t>
+            </w:r>
+          </w:p>
+        </w:tc>
+        <w:tc>
+          <w:tcPr>
+            <w:tcW w:w="1134" w:type="dxa"/>
+            <w:hideMark/>
+          </w:tcPr>
+          <w:p>
+            <w:pPr>
+              <w:spacing w:after="160" w:line="278" w:lineRule="auto"/>
+              <w:cnfStyle w:val="000000100000" w:firstRow="0" w:lastRow="0" w:firstColumn="0" w:lastColumn="0" w:oddVBand="0" w:evenVBand="0" w:oddHBand="1" w:evenHBand="0" w:firstRowFirstColumn="0" w:firstRowLastColumn="0" w:lastRowFirstColumn="0" w:lastRowLastColumn="0"/>
+            </w:pPr>
+            <w:r>
+              <w:t>—</w:t>
+            </w:r>
+          </w:p>
+        </w:tc>
+        <w:tc>
+          <w:tcPr>
+            <w:tcW w:w="1134" w:type="dxa"/>
+            <w:hideMark/>
+          </w:tcPr>
+          <w:p>
+            <w:pPr>
+              <w:spacing w:after="160" w:line="278" w:lineRule="auto"/>
+              <w:cnfStyle w:val="000000100000" w:firstRow="0" w:lastRow="0" w:firstColumn="0" w:lastColumn="0" w:oddVBand="0" w:evenVBand="0" w:oddHBand="1" w:evenHBand="0" w:firstRowFirstColumn="0" w:firstRowLastColumn="0" w:lastRowFirstColumn="0" w:lastRowLastColumn="0"/>
+            </w:pPr>
+            <w:r>
+              <w:t>—</w:t>
+            </w:r>
+          </w:p>
+        </w:tc>
+        <w:tc>
+          <w:tcPr>
+            <w:tcW w:w="1134" w:type="dxa"/>
+            <w:hideMark/>
+          </w:tcPr>
+          <w:p>
+            <w:pPr>
+              <w:spacing w:after="160" w:line="278" w:lineRule="auto"/>
+              <w:cnfStyle w:val="000000100000" w:firstRow="0" w:lastRow="0" w:firstColumn="0" w:lastColumn="0" w:oddVBand="0" w:evenVBand="0" w:oddHBand="1" w:evenHBand="0" w:firstRowFirstColumn="0" w:firstRowLastColumn="0" w:lastRowFirstColumn="0" w:lastRowLastColumn="0"/>
+            </w:pPr>
+            <w:r>
+              <w:t>—</w:t>
+            </w:r>
+          </w:p>
+        </w:tc>
+      </w:tr>
+      <w:tr>
+        <w:tc>
+          <w:tcPr>
+            <w:cnfStyle w:val="001000000000" w:firstRow="0" w:lastRow="0" w:firstColumn="1" w:lastColumn="0" w:oddVBand="0" w:evenVBand="0" w:oddHBand="0" w:evenHBand="0" w:firstRowFirstColumn="0" w:firstRowLastColumn="0" w:lastRowFirstColumn="0" w:lastRowLastColumn="0"/>
+            <w:tcW w:w="1134" w:type="dxa"/>
+            <w:hideMark/>
+          </w:tcPr>
+          <w:p>
+            <w:pPr>
+              <w:spacing w:after="160" w:line="278" w:lineRule="auto"/>
+            </w:pPr>
+            <w:r>
+              <w:t>Precision</w:t>
+            </w:r>
+          </w:p>
+        </w:tc>
+        <w:tc>
+          <w:tcPr>
+            <w:tcW w:w="1134" w:type="dxa"/>
+            <w:hideMark/>
+          </w:tcPr>
+          <w:p>
+            <w:pPr>
+              <w:spacing w:after="160" w:line="278" w:lineRule="auto"/>
+              <w:cnfStyle w:val="000000000000" w:firstRow="0" w:lastRow="0" w:firstColumn="0" w:lastColumn="0" w:oddVBand="0" w:evenVBand="0" w:oddHBand="0" w:evenHBand="0" w:firstRowFirstColumn="0" w:firstRowLastColumn="0" w:lastRowFirstColumn="0" w:lastRowLastColumn="0"/>
+            </w:pPr>
+            <w:r>
+              <w:t>—</w:t>
+            </w:r>
+          </w:p>
+        </w:tc>
+        <w:tc>
+          <w:tcPr>
+            <w:tcW w:w="1134" w:type="dxa"/>
+            <w:hideMark/>
+          </w:tcPr>
+          <w:p>
+            <w:pPr>
+              <w:spacing w:after="160" w:line="278" w:lineRule="auto"/>
+              <w:cnfStyle w:val="000000000000" w:firstRow="0" w:lastRow="0" w:firstColumn="0" w:lastColumn="0" w:oddVBand="0" w:evenVBand="0" w:oddHBand="0" w:evenHBand="0" w:firstRowFirstColumn="0" w:firstRowLastColumn="0" w:lastRowFirstColumn="0" w:lastRowLastColumn="0"/>
+            </w:pPr>
+            <w:r>
+              <w:t>—</w:t>
+            </w:r>
+          </w:p>
+        </w:tc>
+        <w:tc>
+          <w:tcPr>
+            <w:tcW w:w="1134" w:type="dxa"/>
+            <w:hideMark/>
+          </w:tcPr>
+          <w:p>
+            <w:pPr>
+              <w:spacing w:after="160" w:line="278" w:lineRule="auto"/>
+              <w:cnfStyle w:val="000000000000" w:firstRow="0" w:lastRow="0" w:firstColumn="0" w:lastColumn="0" w:oddVBand="0" w:evenVBand="0" w:oddHBand="0" w:evenHBand="0" w:firstRowFirstColumn="0" w:firstRowLastColumn="0" w:lastRowFirstColumn="0" w:lastRowLastColumn="0"/>
+            </w:pPr>
+            <w:r>
+              <w:t>—</w:t>
+            </w:r>
+          </w:p>
+        </w:tc>
+      </w:tr>
+      <w:tr>
+        <w:trPr>
+          <w:cnfStyle w:val="000000100000" w:firstRow="0" w:lastRow="0" w:firstColumn="0" w:lastColumn="0" w:oddVBand="0" w:evenVBand="0" w:oddHBand="1" w:evenHBand="0" w:firstRowFirstColumn="0" w:firstRowLastColumn="0" w:lastRowFirstColumn="0" w:lastRowLastColumn="0"/>
+        </w:trPr>
+        <w:tc>
+          <w:tcPr>
+            <w:cnfStyle w:val="001000000000" w:firstRow="0" w:lastRow="0" w:firstColumn="1" w:lastColumn="0" w:oddVBand="0" w:evenVBand="0" w:oddHBand="0" w:evenHBand="0" w:firstRowFirstColumn="0" w:firstRowLastColumn="0" w:lastRowFirstColumn="0" w:lastRowLastColumn="0"/>
+            <w:tcW w:w="1134" w:type="dxa"/>
+            <w:hideMark/>
+          </w:tcPr>
+          <w:p>
+            <w:pPr>
+              <w:spacing w:after="160" w:line="278" w:lineRule="auto"/>
+            </w:pPr>
+            <w:r>
+              <w:t>Recall</w:t>
+            </w:r>
+          </w:p>
+        </w:tc>
+        <w:tc>
+          <w:tcPr>
+            <w:tcW w:w="1134" w:type="dxa"/>
+            <w:hideMark/>
+          </w:tcPr>
+          <w:p>
+            <w:pPr>
+              <w:spacing w:after="160" w:line="278" w:lineRule="auto"/>
+              <w:cnfStyle w:val="000000100000" w:firstRow="0" w:lastRow="0" w:firstColumn="0" w:lastColumn="0" w:oddVBand="0" w:evenVBand="0" w:oddHBand="1" w:evenHBand="0" w:firstRowFirstColumn="0" w:firstRowLastColumn="0" w:lastRowFirstColumn="0" w:lastRowLastColumn="0"/>
+            </w:pPr>
+            <w:r>
+              <w:t>—</w:t>
+            </w:r>
+          </w:p>
+        </w:tc>
+        <w:tc>
+          <w:tcPr>
+            <w:tcW w:w="1134" w:type="dxa"/>
+            <w:hideMark/>
+          </w:tcPr>
+          <w:p>
+            <w:pPr>
+              <w:spacing w:after="160" w:line="278" w:lineRule="auto"/>
+              <w:cnfStyle w:val="000000100000" w:firstRow="0" w:lastRow="0" w:firstColumn="0" w:lastColumn="0" w:oddVBand="0" w:evenVBand="0" w:oddHBand="1" w:evenHBand="0" w:firstRowFirstColumn="0" w:firstRowLastColumn="0" w:lastRowFirstColumn="0" w:lastRowLastColumn="0"/>
+            </w:pPr>
+            <w:r>
+              <w:t>—</w:t>
+            </w:r>
+          </w:p>
+        </w:tc>
+        <w:tc>
+          <w:tcPr>
+            <w:tcW w:w="1134" w:type="dxa"/>
+            <w:hideMark/>
+          </w:tcPr>
+          <w:p>
+            <w:pPr>
+              <w:spacing w:after="160" w:line="278" w:lineRule="auto"/>
+              <w:cnfStyle w:val="000000100000" w:firstRow="0" w:lastRow="0" w:firstColumn="0" w:lastColumn="0" w:oddVBand="0" w:evenVBand="0" w:oddHBand="1" w:evenHBand="0" w:firstRowFirstColumn="0" w:firstRowLastColumn="0" w:lastRowFirstColumn="0" w:lastRowLastColumn="0"/>
+            </w:pPr>
+            <w:r>
+              <w:t>—</w:t>
+            </w:r>
+          </w:p>
+        </w:tc>
+      </w:tr>
+      <w:tr>
+        <w:tc>
+          <w:tcPr>
+            <w:cnfStyle w:val="001000000000" w:firstRow="0" w:lastRow="0" w:firstColumn="1" w:lastColumn="0" w:oddVBand="0" w:evenVBand="0" w:oddHBand="0" w:evenHBand="0" w:firstRowFirstColumn="0" w:firstRowLastColumn="0" w:lastRowFirstColumn="0" w:lastRowLastColumn="0"/>
+            <w:tcW w:w="1134" w:type="dxa"/>
+            <w:hideMark/>
+          </w:tcPr>
+          <w:p>
+            <w:pPr>
+              <w:spacing w:after="160" w:line="278" w:lineRule="auto"/>
+            </w:pPr>
+            <w:r>
+              <w:t>F1</w:t>
+            </w:r>
+          </w:p>
+        </w:tc>
+        <w:tc>
+          <w:tcPr>
+            <w:tcW w:w="1134" w:type="dxa"/>
+            <w:hideMark/>
+          </w:tcPr>
+          <w:p>
+            <w:pPr>
+              <w:spacing w:after="160" w:line="278" w:lineRule="auto"/>
+              <w:cnfStyle w:val="000000000000" w:firstRow="0" w:lastRow="0" w:firstColumn="0" w:lastColumn="0" w:oddVBand="0" w:evenVBand="0" w:oddHBand="0" w:evenHBand="0" w:firstRowFirstColumn="0" w:firstRowLastColumn="0" w:lastRowFirstColumn="0" w:lastRowLastColumn="0"/>
+            </w:pPr>
+            <w:r>
+              <w:t>—</w:t>
+            </w:r>
+          </w:p>
+        </w:tc>
+        <w:tc>
+          <w:tcPr>
+            <w:tcW w:w="1134" w:type="dxa"/>
+            <w:hideMark/>
+          </w:tcPr>
+          <w:p>
+            <w:pPr>
+              <w:spacing w:after="160" w:line="278" w:lineRule="auto"/>
+              <w:cnfStyle w:val="000000000000" w:firstRow="0" w:lastRow="0" w:firstColumn="0" w:lastColumn="0" w:oddVBand="0" w:evenVBand="0" w:oddHBand="0" w:evenHBand="0" w:firstRowFirstColumn="0" w:firstRowLastColumn="0" w:lastRowFirstColumn="0" w:lastRowLastColumn="0"/>
+            </w:pPr>
+            <w:r>
+              <w:t>—</w:t>
+            </w:r>
+          </w:p>
+        </w:tc>
+        <w:tc>
+          <w:tcPr>
+            <w:tcW w:w="1134" w:type="dxa"/>
+            <w:hideMark/>
+          </w:tcPr>
+          <w:p>
+            <w:pPr>
+              <w:spacing w:after="160" w:line="278" w:lineRule="auto"/>
+              <w:cnfStyle w:val="000000000000" w:firstRow="0" w:lastRow="0" w:firstColumn="0" w:lastColumn="0" w:oddVBand="0" w:evenVBand="0" w:oddHBand="0" w:evenHBand="0" w:firstRowFirstColumn="0" w:firstRowLastColumn="0" w:lastRowFirstColumn="0" w:lastRowLastColumn="0"/>
+            </w:pPr>
+            <w:r>
+              <w:t>—</w:t>
+            </w:r>
+          </w:p>
+        </w:tc>
+      </w:tr>
+      <w:tr>
+        <w:trPr>
+          <w:cnfStyle w:val="000000100000" w:firstRow="0" w:lastRow="0" w:firstColumn="0" w:lastColumn="0" w:oddVBand="0" w:evenVBand="0" w:oddHBand="1" w:evenHBand="0" w:firstRowFirstColumn="0" w:firstRowLastColumn="0" w:lastRowFirstColumn="0" w:lastRowLastColumn="0"/>
+        </w:trPr>
+        <w:tc>
+          <w:tcPr>
+            <w:cnfStyle w:val="001000000000" w:firstRow="0" w:lastRow="0" w:firstColumn="1" w:lastColumn="0" w:oddVBand="0" w:evenVBand="0" w:oddHBand="0" w:evenHBand="0" w:firstRowFirstColumn="0" w:firstRowLastColumn="0" w:lastRowFirstColumn="0" w:lastRowLastColumn="0"/>
+            <w:tcW w:w="1134" w:type="dxa"/>
+            <w:hideMark/>
+          </w:tcPr>
+          <w:p>
+            <w:pPr>
+              <w:spacing w:after="160" w:line="278" w:lineRule="auto"/>
+            </w:pPr>
+            <w:r>
+              <w:t>Training time</w:t>
+            </w:r>
+          </w:p>
+        </w:tc>
+        <w:tc>
+          <w:tcPr>
+            <w:tcW w:w="1134" w:type="dxa"/>
+            <w:hideMark/>
+          </w:tcPr>
+          <w:p>
+            <w:pPr>
+              <w:spacing w:after="160" w:line="278" w:lineRule="auto"/>
+              <w:cnfStyle w:val="000000100000" w:firstRow="0" w:lastRow="0" w:firstColumn="0" w:lastColumn="0" w:oddVBand="0" w:evenVBand="0" w:oddHBand="1" w:evenHBand="0" w:firstRowFirstColumn="0" w:firstRowLastColumn="0" w:lastRowFirstColumn="0" w:lastRowLastColumn="0"/>
+            </w:pPr>
+            <w:r>
+              <w:t>—</w:t>
+            </w:r>
+          </w:p>
+        </w:tc>
+        <w:tc>
+          <w:tcPr>
+            <w:tcW w:w="1134" w:type="dxa"/>
+            <w:hideMark/>
+          </w:tcPr>
+          <w:p>
+            <w:pPr>
+              <w:spacing w:after="160" w:line="278" w:lineRule="auto"/>
+              <w:cnfStyle w:val="000000100000" w:firstRow="0" w:lastRow="0" w:firstColumn="0" w:lastColumn="0" w:oddVBand="0" w:evenVBand="0" w:oddHBand="1" w:evenHBand="0" w:firstRowFirstColumn="0" w:firstRowLastColumn="0" w:lastRowFirstColumn="0" w:lastRowLastColumn="0"/>
+            </w:pPr>
+            <w:r>
+              <w:t>—</w:t>
+            </w:r>
+          </w:p>
+        </w:tc>
+        <w:tc>
+          <w:tcPr>
+            <w:tcW w:w="1134" w:type="dxa"/>
+            <w:hideMark/>
+          </w:tcPr>
+          <w:p>
+            <w:pPr>
+              <w:spacing w:after="160" w:line="278" w:lineRule="auto"/>
+              <w:cnfStyle w:val="000000100000" w:firstRow="0" w:lastRow="0" w:firstColumn="0" w:lastColumn="0" w:oddVBand="0" w:evenVBand="0" w:oddHBand="1" w:evenHBand="0" w:firstRowFirstColumn="0" w:firstRowLastColumn="0" w:lastRowFirstColumn="0" w:lastRowLastColumn="0"/>
+            </w:pPr>
+            <w:r>
+              <w:t>—</w:t>
+            </w:r>
+          </w:p>
+        </w:tc>
+      </w:tr>
+      <w:tr>
+        <w:tc>
+          <w:tcPr>
+            <w:cnfStyle w:val="001000000000" w:firstRow="0" w:lastRow="0" w:firstColumn="1" w:lastColumn="0" w:oddVBand="0" w:evenVBand="0" w:oddHBand="0" w:evenHBand="0" w:firstRowFirstColumn="0" w:firstRowLastColumn="0" w:lastRowFirstColumn="0" w:lastRowLastColumn="0"/>
+            <w:tcW w:w="1134" w:type="dxa"/>
+            <w:hideMark/>
+          </w:tcPr>
+          <w:p>
+            <w:pPr>
+              <w:spacing w:after="160" w:line="278" w:lineRule="auto"/>
+            </w:pPr>
+            <w:r>
+              <w:t>Parameters</w:t>
+            </w:r>
+          </w:p>
+        </w:tc>
+        <w:tc>
+          <w:tcPr>
+            <w:tcW w:w="1134" w:type="dxa"/>
+            <w:hideMark/>
+          </w:tcPr>
+          <w:p>
+            <w:pPr>
+              <w:spacing w:after="160" w:line="278" w:lineRule="auto"/>
+              <w:cnfStyle w:val="000000000000" w:firstRow="0" w:lastRow="0" w:firstColumn="0" w:lastColumn="0" w:oddVBand="0" w:evenVBand="0" w:oddHBand="0" w:evenHBand="0" w:firstRowFirstColumn="0" w:firstRowLastColumn="0" w:lastRowFirstColumn="0" w:lastRowLastColumn="0"/>
+            </w:pPr>
+            <w:r>
+              <w:t>—</w:t>
+            </w:r>
+          </w:p>
+        </w:tc>
+        <w:tc>
+          <w:tcPr>
+            <w:tcW w:w="1134" w:type="dxa"/>
+            <w:hideMark/>
+          </w:tcPr>
+          <w:p>
+            <w:pPr>
+              <w:spacing w:after="160" w:line="278" w:lineRule="auto"/>
+              <w:cnfStyle w:val="000000000000" w:firstRow="0" w:lastRow="0" w:firstColumn="0" w:lastColumn="0" w:oddVBand="0" w:evenVBand="0" w:oddHBand="0" w:evenHBand="0" w:firstRowFirstColumn="0" w:firstRowLastColumn="0" w:lastRowFirstColumn="0" w:lastRowLastColumn="0"/>
+            </w:pPr>
+            <w:r>
+              <w:t>—</w:t>
+            </w:r>
+          </w:p>
+        </w:tc>
+        <w:tc>
+          <w:tcPr>
+            <w:tcW w:w="1134" w:type="dxa"/>
+            <w:hideMark/>
+          </w:tcPr>
+          <w:p>
+            <w:pPr>
+              <w:spacing w:after="160" w:line="278" w:lineRule="auto"/>
+              <w:cnfStyle w:val="000000000000" w:firstRow="0" w:lastRow="0" w:firstColumn="0" w:lastColumn="0" w:oddVBand="0" w:evenVBand="0" w:oddHBand="0" w:evenHBand="0" w:firstRowFirstColumn="0" w:firstRowLastColumn="0" w:lastRowFirstColumn="0" w:lastRowLastColumn="0"/>
+            </w:pPr>
+            <w:r>
+              <w:t>—</w:t>
+            </w:r>
+          </w:p>
+        </w:tc>
+      </w:tr>
+    </w:tbl>
+    <w:p/>
+    <w:tbl>
+      <w:tblPr>
+        <w:tblW w:w="0" w:type="auto"/>
+        <w:tblCellSpacing w:w="15" w:type="dxa"/>
+        <w:tblCellMar>
+          <w:top w:w="15" w:type="dxa"/>
+          <w:left w:w="15" w:type="dxa"/>
+          <w:bottom w:w="15" w:type="dxa"/>
+          <w:right w:w="15" w:type="dxa"/>
+        </w:tblCellMar>
+        <w:tblLook w:val="04A0" w:firstRow="1" w:lastRow="0" w:firstColumn="1" w:lastColumn="0" w:noHBand="0" w:noVBand="1"/>
+      </w:tblPr>
+      <w:tblGrid>
+        <w:gridCol w:w="1499"/>
+        <w:gridCol w:w="1697"/>
+        <w:gridCol w:w="2442"/>
+        <w:gridCol w:w="2227"/>
+        <w:gridCol w:w="292"/>
+        <w:gridCol w:w="81"/>
+      </w:tblGrid>
+      <w:tr>
+        <w:trPr>
+          <w:tblHeader/>
+          <w:tblCellSpacing w:w="15" w:type="dxa"/>
+        </w:trPr>
+        <w:tc>
+          <w:tcPr>
+            <w:tcW w:w="0" w:type="auto"/>
+            <w:vAlign w:val="center"/>
+            <w:hideMark/>
+          </w:tcPr>
+          <w:p>
+            <w:pPr>
+              <w:rPr>
+                <w:b/>
+                <w:bCs/>
+              </w:rPr>
+            </w:pPr>
+            <w:r>
+              <w:rPr>
+                <w:b/>
+                <w:bCs/>
+              </w:rPr>
+              <w:t>Model</w:t>
+            </w:r>
+          </w:p>
+        </w:tc>
+        <w:tc>
+          <w:tcPr>
+            <w:tcW w:w="0" w:type="auto"/>
+            <w:vAlign w:val="center"/>
+            <w:hideMark/>
+          </w:tcPr>
+          <w:p>
+            <w:pPr>
+              <w:rPr>
+                <w:b/>
+                <w:bCs/>
+              </w:rPr>
+            </w:pPr>
+            <w:r>
+              <w:rPr>
+                <w:b/>
+                <w:bCs/>
+              </w:rPr>
+              <w:t>Spatial structure</w:t>
+            </w:r>
+          </w:p>
+        </w:tc>
+        <w:tc>
+          <w:tcPr>
+            <w:tcW w:w="0" w:type="auto"/>
+            <w:vAlign w:val="center"/>
+            <w:hideMark/>
+          </w:tcPr>
+          <w:p>
+            <w:pPr>
+              <w:rPr>
+                <w:b/>
+                <w:bCs/>
+              </w:rPr>
+            </w:pPr>
+            <w:proofErr w:type="spellStart"/>
+            <w:r>
+              <w:rPr>
+                <w:b/>
+                <w:bCs/>
+              </w:rPr>
+              <w:t>Neighbor</w:t>
+            </w:r>
+            <w:proofErr w:type="spellEnd"/>
+            <w:r>
+              <w:rPr>
+                <w:b/>
+                <w:bCs/>
+              </w:rPr>
+              <w:t xml:space="preserve"> attention</w:t>
+            </w:r>
+          </w:p>
+        </w:tc>
+        <w:tc>
+          <w:tcPr>
+            <w:tcW w:w="0" w:type="auto"/>
+            <w:vAlign w:val="center"/>
+            <w:hideMark/>
+          </w:tcPr>
+          <w:p>
+            <w:pPr>
+              <w:rPr>
+                <w:b/>
+                <w:bCs/>
+              </w:rPr>
+            </w:pPr>
+            <w:r>
+              <w:rPr>
+                <w:b/>
+                <w:bCs/>
+              </w:rPr>
+              <w:t>Temporal information</w:t>
+            </w:r>
+          </w:p>
+        </w:tc>
+        <w:tc>
+          <w:tcPr>
+            <w:tcW w:w="0" w:type="auto"/>
+            <w:vAlign w:val="center"/>
+            <w:hideMark/>
+          </w:tcPr>
+          <w:p>
+            <w:pPr>
+              <w:rPr>
+                <w:b/>
+                <w:bCs/>
+              </w:rPr>
+            </w:pPr>
+            <w:r>
+              <w:rPr>
+                <w:b/>
+                <w:bCs/>
+              </w:rPr>
+              <w:t>F1</w:t>
+            </w:r>
+          </w:p>
+        </w:tc>
+        <w:tc>
+          <w:tcPr>
+            <w:tcW w:w="0" w:type="auto"/>
+          </w:tcPr>
+          <w:p>
+            <w:pPr>
+              <w:rPr>
+                <w:b/>
+                <w:bCs/>
+              </w:rPr>
+            </w:pPr>
+          </w:p>
+        </w:tc>
+      </w:tr>
+      <w:tr>
+        <w:trPr>
+          <w:tblCellSpacing w:w="15" w:type="dxa"/>
+        </w:trPr>
+        <w:tc>
+          <w:tcPr>
+            <w:tcW w:w="0" w:type="auto"/>
+            <w:vAlign w:val="center"/>
+            <w:hideMark/>
+          </w:tcPr>
+          <w:p>
+            <w:r>
+              <w:t>GCN</w:t>
+            </w:r>
+          </w:p>
+        </w:tc>
+        <w:tc>
+          <w:tcPr>
+            <w:tcW w:w="0" w:type="auto"/>
+            <w:vAlign w:val="center"/>
+            <w:hideMark/>
+          </w:tcPr>
+          <w:p>
+            <w:r>
+              <w:rPr>
+                <w:rFonts w:ascii="Segoe UI Symbol" w:hAnsi="Segoe UI Symbol" w:cs="Segoe UI Symbol"/>
+              </w:rPr>
+              <w:t>✓</w:t>
+            </w:r>
+          </w:p>
+        </w:tc>
+        <w:tc>
+          <w:tcPr>
+            <w:tcW w:w="0" w:type="auto"/>
+            <w:vAlign w:val="center"/>
+            <w:hideMark/>
+          </w:tcPr>
+          <w:p>
+            <w:r>
+              <w:t>—</w:t>
+            </w:r>
+          </w:p>
+        </w:tc>
+        <w:tc>
+          <w:tcPr>
+            <w:tcW w:w="0" w:type="auto"/>
+            <w:vAlign w:val="center"/>
+            <w:hideMark/>
+          </w:tcPr>
+          <w:p>
+            <w:r>
+              <w:t>—</w:t>
+            </w:r>
+          </w:p>
+        </w:tc>
+        <w:tc>
+          <w:tcPr>
+            <w:tcW w:w="0" w:type="auto"/>
+            <w:vAlign w:val="center"/>
+            <w:hideMark/>
+          </w:tcPr>
+          <w:p>
+            <w:r>
+              <w:t>—</w:t>
+            </w:r>
+          </w:p>
+        </w:tc>
+        <w:tc>
+          <w:tcPr>
+            <w:tcW w:w="0" w:type="auto"/>
+          </w:tcPr>
+          <w:p/>
+        </w:tc>
+      </w:tr>
+      <w:tr>
+        <w:trPr>
+          <w:tblCellSpacing w:w="15" w:type="dxa"/>
+        </w:trPr>
+        <w:tc>
+          <w:tcPr>
+            <w:tcW w:w="0" w:type="auto"/>
+            <w:vAlign w:val="center"/>
+            <w:hideMark/>
+          </w:tcPr>
+          <w:p>
+            <w:proofErr w:type="spellStart"/>
+            <w:r>
+              <w:t>GraphSAGE</w:t>
+            </w:r>
+            <w:proofErr w:type="spellEnd"/>
+          </w:p>
+        </w:tc>
+        <w:tc>
+          <w:tcPr>
+            <w:tcW w:w="0" w:type="auto"/>
+            <w:vAlign w:val="center"/>
+            <w:hideMark/>
+          </w:tcPr>
+          <w:p>
+            <w:r>
+              <w:rPr>
+                <w:rFonts w:ascii="Segoe UI Symbol" w:hAnsi="Segoe UI Symbol" w:cs="Segoe UI Symbol"/>
+              </w:rPr>
+              <w:t>✓</w:t>
+            </w:r>
+          </w:p>
+        </w:tc>
+        <w:tc>
+          <w:tcPr>
+            <w:tcW w:w="0" w:type="auto"/>
+            <w:vAlign w:val="center"/>
+            <w:hideMark/>
+          </w:tcPr>
+          <w:p>
+            <w:r>
+              <w:t>—</w:t>
+            </w:r>
+          </w:p>
+        </w:tc>
+        <w:tc>
+          <w:tcPr>
+            <w:tcW w:w="0" w:type="auto"/>
+            <w:vAlign w:val="center"/>
+            <w:hideMark/>
+          </w:tcPr>
+          <w:p>
+            <w:r>
+              <w:t>—</w:t>
+            </w:r>
+          </w:p>
+        </w:tc>
+        <w:tc>
+          <w:tcPr>
+            <w:tcW w:w="0" w:type="auto"/>
+            <w:vAlign w:val="center"/>
+            <w:hideMark/>
+          </w:tcPr>
+          <w:p>
+            <w:r>
+              <w:t>—</w:t>
+            </w:r>
+          </w:p>
+        </w:tc>
+        <w:tc>
+          <w:tcPr>
+            <w:tcW w:w="0" w:type="auto"/>
+          </w:tcPr>
+          <w:p/>
+        </w:tc>
+      </w:tr>
+      <w:tr>
+        <w:trPr>
+          <w:tblCellSpacing w:w="15" w:type="dxa"/>
+        </w:trPr>
+        <w:tc>
+          <w:tcPr>
+            <w:tcW w:w="0" w:type="auto"/>
+            <w:vAlign w:val="center"/>
+            <w:hideMark/>
+          </w:tcPr>
+          <w:p>
+            <w:r>
+              <w:t>GAT</w:t>
+            </w:r>
+          </w:p>
+        </w:tc>
+        <w:tc>
+          <w:tcPr>
+            <w:tcW w:w="0" w:type="auto"/>
+            <w:vAlign w:val="center"/>
+            <w:hideMark/>
+          </w:tcPr>
+          <w:p>
+            <w:r>
+              <w:rPr>
+                <w:rFonts w:ascii="Segoe UI Symbol" w:hAnsi="Segoe UI Symbol" w:cs="Segoe UI Symbol"/>
+              </w:rPr>
+              <w:t>✓</w:t>
+            </w:r>
+          </w:p>
+        </w:tc>
+        <w:tc>
+          <w:tcPr>
+            <w:tcW w:w="0" w:type="auto"/>
+            <w:vAlign w:val="center"/>
+            <w:hideMark/>
+          </w:tcPr>
+          <w:p>
+            <w:r>
+              <w:rPr>
+                <w:rFonts w:ascii="Segoe UI Symbol" w:hAnsi="Segoe UI Symbol" w:cs="Segoe UI Symbol"/>
+              </w:rPr>
+              <w:t>✓</w:t>
+            </w:r>
+          </w:p>
+        </w:tc>
+        <w:tc>
+          <w:tcPr>
+            <w:tcW w:w="0" w:type="auto"/>
+            <w:vAlign w:val="center"/>
+            <w:hideMark/>
+          </w:tcPr>
+          <w:p>
+            <w:r>
+              <w:t>—</w:t>
+            </w:r>
+          </w:p>
+        </w:tc>
+        <w:tc>
+          <w:tcPr>
+            <w:tcW w:w="0" w:type="auto"/>
+            <w:vAlign w:val="center"/>
+            <w:hideMark/>
+          </w:tcPr>
+          <w:p>
+            <w:r>
+              <w:t>—</w:t>
+            </w:r>
+          </w:p>
+        </w:tc>
+        <w:tc>
+          <w:tcPr>
+            <w:tcW w:w="0" w:type="auto"/>
+          </w:tcPr>
+          <w:p/>
+        </w:tc>
+      </w:tr>
+      <w:tr>
+        <w:trPr>
+          <w:tblCellSpacing w:w="15" w:type="dxa"/>
+        </w:trPr>
+        <w:tc>
+          <w:tcPr>
+            <w:tcW w:w="0" w:type="auto"/>
+            <w:vAlign w:val="center"/>
+            <w:hideMark/>
+          </w:tcPr>
+          <w:p>
+            <w:r>
+              <w:t>Temporal GNN</w:t>
+            </w:r>
+          </w:p>
+        </w:tc>
+        <w:tc>
+          <w:tcPr>
+            <w:tcW w:w="0" w:type="auto"/>
+            <w:vAlign w:val="center"/>
+            <w:hideMark/>
+          </w:tcPr>
+          <w:p>
+            <w:r>
+              <w:rPr>
+                <w:rFonts w:ascii="Segoe UI Symbol" w:hAnsi="Segoe UI Symbol" w:cs="Segoe UI Symbol"/>
+              </w:rPr>
+              <w:t>✓</w:t>
+            </w:r>
+          </w:p>
+        </w:tc>
+        <w:tc>
+          <w:tcPr>
+            <w:tcW w:w="0" w:type="auto"/>
+            <w:vAlign w:val="center"/>
+            <w:hideMark/>
+          </w:tcPr>
+          <w:p>
+            <w:r>
+              <w:t>depends on architecture</w:t>
+            </w:r>
+          </w:p>
+        </w:tc>
+        <w:tc>
+          <w:tcPr>
+            <w:tcW w:w="0" w:type="auto"/>
+            <w:vAlign w:val="center"/>
+            <w:hideMark/>
+          </w:tcPr>
+          <w:p>
+            <w:r>
+              <w:rPr>
+                <w:rFonts w:ascii="Segoe UI Symbol" w:hAnsi="Segoe UI Symbol" w:cs="Segoe UI Symbol"/>
+              </w:rPr>
+              <w:t>✓</w:t>
+            </w:r>
+          </w:p>
+        </w:tc>
+        <w:tc>
+          <w:tcPr>
+            <w:tcW w:w="0" w:type="auto"/>
+            <w:vAlign w:val="center"/>
+            <w:hideMark/>
+          </w:tcPr>
+          <w:p>
+            <w:r>
+              <w:t>—</w:t>
+            </w:r>
+          </w:p>
+        </w:tc>
+        <w:tc>
+          <w:tcPr>
+            <w:tcW w:w="0" w:type="auto"/>
+          </w:tcPr>
+          <w:p/>
+        </w:tc>
+      </w:tr>
+    </w:tbl>
     <w:p/>
     <w:sectPr>
       <w:pgSz w:w="11906" w:h="16838"/>
@@ -3347,6 +4274,218 @@
       <w:spacing w:val="5"/>
     </w:rPr>
   </w:style>
+  <w:style w:type="table" w:styleId="GridTable5Dark-Accent2">
+    <w:name w:val="Grid Table 5 Dark Accent 2"/>
+    <w:basedOn w:val="TableNormal"/>
+    <w:uiPriority w:val="50"/>
+    <w:rsid w:val="00F22306"/>
+    <w:pPr>
+      <w:spacing w:after="0" w:line="240" w:lineRule="auto"/>
+    </w:pPr>
+    <w:tblPr>
+      <w:tblStyleRowBandSize w:val="1"/>
+      <w:tblStyleColBandSize w:val="1"/>
+      <w:tblBorders>
+        <w:top w:val="single" w:sz="4" w:space="0" w:color="FFFFFF" w:themeColor="background1"/>
+        <w:left w:val="single" w:sz="4" w:space="0" w:color="FFFFFF" w:themeColor="background1"/>
+        <w:bottom w:val="single" w:sz="4" w:space="0" w:color="FFFFFF" w:themeColor="background1"/>
+        <w:right w:val="single" w:sz="4" w:space="0" w:color="FFFFFF" w:themeColor="background1"/>
+        <w:insideH w:val="single" w:sz="4" w:space="0" w:color="FFFFFF" w:themeColor="background1"/>
+        <w:insideV w:val="single" w:sz="4" w:space="0" w:color="FFFFFF" w:themeColor="background1"/>
+      </w:tblBorders>
+    </w:tblPr>
+    <w:tcPr>
+      <w:shd w:val="clear" w:color="auto" w:fill="FBE4D5" w:themeFill="accent2" w:themeFillTint="33"/>
+    </w:tcPr>
+    <w:tblStylePr w:type="firstRow">
+      <w:rPr>
+        <w:b/>
+        <w:bCs/>
+        <w:color w:val="FFFFFF" w:themeColor="background1"/>
+      </w:rPr>
+      <w:tblPr/>
+      <w:tcPr>
+        <w:tcBorders>
+          <w:top w:val="single" w:sz="4" w:space="0" w:color="FFFFFF" w:themeColor="background1"/>
+          <w:left w:val="single" w:sz="4" w:space="0" w:color="FFFFFF" w:themeColor="background1"/>
+          <w:right w:val="single" w:sz="4" w:space="0" w:color="FFFFFF" w:themeColor="background1"/>
+          <w:insideH w:val="nil"/>
+          <w:insideV w:val="nil"/>
+        </w:tcBorders>
+        <w:shd w:val="clear" w:color="auto" w:fill="ED7D31" w:themeFill="accent2"/>
+      </w:tcPr>
+    </w:tblStylePr>
+    <w:tblStylePr w:type="lastRow">
+      <w:rPr>
+        <w:b/>
+        <w:bCs/>
+        <w:color w:val="FFFFFF" w:themeColor="background1"/>
+      </w:rPr>
+      <w:tblPr/>
+      <w:tcPr>
+        <w:tcBorders>
+          <w:left w:val="single" w:sz="4" w:space="0" w:color="FFFFFF" w:themeColor="background1"/>
+          <w:bottom w:val="single" w:sz="4" w:space="0" w:color="FFFFFF" w:themeColor="background1"/>
+          <w:right w:val="single" w:sz="4" w:space="0" w:color="FFFFFF" w:themeColor="background1"/>
+          <w:insideH w:val="nil"/>
+          <w:insideV w:val="nil"/>
+        </w:tcBorders>
+        <w:shd w:val="clear" w:color="auto" w:fill="ED7D31" w:themeFill="accent2"/>
+      </w:tcPr>
+    </w:tblStylePr>
+    <w:tblStylePr w:type="firstCol">
+      <w:rPr>
+        <w:b/>
+        <w:bCs/>
+        <w:color w:val="FFFFFF" w:themeColor="background1"/>
+      </w:rPr>
+      <w:tblPr/>
+      <w:tcPr>
+        <w:tcBorders>
+          <w:top w:val="single" w:sz="4" w:space="0" w:color="FFFFFF" w:themeColor="background1"/>
+          <w:left w:val="single" w:sz="4" w:space="0" w:color="FFFFFF" w:themeColor="background1"/>
+          <w:bottom w:val="single" w:sz="4" w:space="0" w:color="FFFFFF" w:themeColor="background1"/>
+          <w:insideV w:val="nil"/>
+        </w:tcBorders>
+        <w:shd w:val="clear" w:color="auto" w:fill="ED7D31" w:themeFill="accent2"/>
+      </w:tcPr>
+    </w:tblStylePr>
+    <w:tblStylePr w:type="lastCol">
+      <w:rPr>
+        <w:b/>
+        <w:bCs/>
+        <w:color w:val="FFFFFF" w:themeColor="background1"/>
+      </w:rPr>
+      <w:tblPr/>
+      <w:tcPr>
+        <w:tcBorders>
+          <w:top w:val="single" w:sz="4" w:space="0" w:color="FFFFFF" w:themeColor="background1"/>
+          <w:bottom w:val="single" w:sz="4" w:space="0" w:color="FFFFFF" w:themeColor="background1"/>
+          <w:right w:val="single" w:sz="4" w:space="0" w:color="FFFFFF" w:themeColor="background1"/>
+          <w:insideV w:val="nil"/>
+        </w:tcBorders>
+        <w:shd w:val="clear" w:color="auto" w:fill="ED7D31" w:themeFill="accent2"/>
+      </w:tcPr>
+    </w:tblStylePr>
+    <w:tblStylePr w:type="band1Vert">
+      <w:tblPr/>
+      <w:tcPr>
+        <w:shd w:val="clear" w:color="auto" w:fill="F7CAAC" w:themeFill="accent2" w:themeFillTint="66"/>
+      </w:tcPr>
+    </w:tblStylePr>
+    <w:tblStylePr w:type="band1Horz">
+      <w:tblPr/>
+      <w:tcPr>
+        <w:shd w:val="clear" w:color="auto" w:fill="F7CAAC" w:themeFill="accent2" w:themeFillTint="66"/>
+      </w:tcPr>
+    </w:tblStylePr>
+  </w:style>
+  <w:style w:type="table" w:styleId="GridTable5Dark-Accent5">
+    <w:name w:val="Grid Table 5 Dark Accent 5"/>
+    <w:basedOn w:val="TableNormal"/>
+    <w:uiPriority w:val="50"/>
+    <w:rsid w:val="00F22306"/>
+    <w:pPr>
+      <w:spacing w:after="0" w:line="240" w:lineRule="auto"/>
+    </w:pPr>
+    <w:tblPr>
+      <w:tblStyleRowBandSize w:val="1"/>
+      <w:tblStyleColBandSize w:val="1"/>
+      <w:tblBorders>
+        <w:top w:val="single" w:sz="4" w:space="0" w:color="FFFFFF" w:themeColor="background1"/>
+        <w:left w:val="single" w:sz="4" w:space="0" w:color="FFFFFF" w:themeColor="background1"/>
+        <w:bottom w:val="single" w:sz="4" w:space="0" w:color="FFFFFF" w:themeColor="background1"/>
+        <w:right w:val="single" w:sz="4" w:space="0" w:color="FFFFFF" w:themeColor="background1"/>
+        <w:insideH w:val="single" w:sz="4" w:space="0" w:color="FFFFFF" w:themeColor="background1"/>
+        <w:insideV w:val="single" w:sz="4" w:space="0" w:color="FFFFFF" w:themeColor="background1"/>
+      </w:tblBorders>
+    </w:tblPr>
+    <w:tcPr>
+      <w:shd w:val="clear" w:color="auto" w:fill="DEEAF6" w:themeFill="accent5" w:themeFillTint="33"/>
+    </w:tcPr>
+    <w:tblStylePr w:type="firstRow">
+      <w:rPr>
+        <w:b/>
+        <w:bCs/>
+        <w:color w:val="FFFFFF" w:themeColor="background1"/>
+      </w:rPr>
+      <w:tblPr/>
+      <w:tcPr>
+        <w:tcBorders>
+          <w:top w:val="single" w:sz="4" w:space="0" w:color="FFFFFF" w:themeColor="background1"/>
+          <w:left w:val="single" w:sz="4" w:space="0" w:color="FFFFFF" w:themeColor="background1"/>
+          <w:right w:val="single" w:sz="4" w:space="0" w:color="FFFFFF" w:themeColor="background1"/>
+          <w:insideH w:val="nil"/>
+          <w:insideV w:val="nil"/>
+        </w:tcBorders>
+        <w:shd w:val="clear" w:color="auto" w:fill="5B9BD5" w:themeFill="accent5"/>
+      </w:tcPr>
+    </w:tblStylePr>
+    <w:tblStylePr w:type="lastRow">
+      <w:rPr>
+        <w:b/>
+        <w:bCs/>
+        <w:color w:val="FFFFFF" w:themeColor="background1"/>
+      </w:rPr>
+      <w:tblPr/>
+      <w:tcPr>
+        <w:tcBorders>
+          <w:left w:val="single" w:sz="4" w:space="0" w:color="FFFFFF" w:themeColor="background1"/>
+          <w:bottom w:val="single" w:sz="4" w:space="0" w:color="FFFFFF" w:themeColor="background1"/>
+          <w:right w:val="single" w:sz="4" w:space="0" w:color="FFFFFF" w:themeColor="background1"/>
+          <w:insideH w:val="nil"/>
+          <w:insideV w:val="nil"/>
+        </w:tcBorders>
+        <w:shd w:val="clear" w:color="auto" w:fill="5B9BD5" w:themeFill="accent5"/>
+      </w:tcPr>
+    </w:tblStylePr>
+    <w:tblStylePr w:type="firstCol">
+      <w:rPr>
+        <w:b/>
+        <w:bCs/>
+        <w:color w:val="FFFFFF" w:themeColor="background1"/>
+      </w:rPr>
+      <w:tblPr/>
+      <w:tcPr>
+        <w:tcBorders>
+          <w:top w:val="single" w:sz="4" w:space="0" w:color="FFFFFF" w:themeColor="background1"/>
+          <w:left w:val="single" w:sz="4" w:space="0" w:color="FFFFFF" w:themeColor="background1"/>
+          <w:bottom w:val="single" w:sz="4" w:space="0" w:color="FFFFFF" w:themeColor="background1"/>
+          <w:insideV w:val="nil"/>
+        </w:tcBorders>
+        <w:shd w:val="clear" w:color="auto" w:fill="5B9BD5" w:themeFill="accent5"/>
+      </w:tcPr>
+    </w:tblStylePr>
+    <w:tblStylePr w:type="lastCol">
+      <w:rPr>
+        <w:b/>
+        <w:bCs/>
+        <w:color w:val="FFFFFF" w:themeColor="background1"/>
+      </w:rPr>
+      <w:tblPr/>
+      <w:tcPr>
+        <w:tcBorders>
+          <w:top w:val="single" w:sz="4" w:space="0" w:color="FFFFFF" w:themeColor="background1"/>
+          <w:bottom w:val="single" w:sz="4" w:space="0" w:color="FFFFFF" w:themeColor="background1"/>
+          <w:right w:val="single" w:sz="4" w:space="0" w:color="FFFFFF" w:themeColor="background1"/>
+          <w:insideV w:val="nil"/>
+        </w:tcBorders>
+        <w:shd w:val="clear" w:color="auto" w:fill="5B9BD5" w:themeFill="accent5"/>
+      </w:tcPr>
+    </w:tblStylePr>
+    <w:tblStylePr w:type="band1Vert">
+      <w:tblPr/>
+      <w:tcPr>
+        <w:shd w:val="clear" w:color="auto" w:fill="BDD6EE" w:themeFill="accent5" w:themeFillTint="66"/>
+      </w:tcPr>
+    </w:tblStylePr>
+    <w:tblStylePr w:type="band1Horz">
+      <w:tblPr/>
+      <w:tcPr>
+        <w:shd w:val="clear" w:color="auto" w:fill="BDD6EE" w:themeFill="accent5" w:themeFillTint="66"/>
+      </w:tcPr>
+    </w:tblStylePr>
+  </w:style>
 </w:styles>
 </file>
 

</xml_diff>